<commit_message>
Update schema counts across docs to reconciled totals (447 tables, 1,907 FKs)
Co-Authored-By: Claude Opus 4.8 (1M context) <noreply@anthropic.com>
</commit_message>
<xml_diff>
--- a/docs/docx/EXECUTIVE_OVERVIEW.docx
+++ b/docs/docx/EXECUTIVE_OVERVIEW.docx
@@ -963,7 +963,7 @@
         <w:t>Consolidated data model:</w:t>
       </w:r>
       <w:r>
-        <w:t xml:space="preserve"> a 403-table PostgreSQL schema, </w:t>
+        <w:t xml:space="preserve"> a 447-table PostgreSQL schema, </w:t>
       </w:r>
       <w:r>
         <w:rPr>
@@ -1349,7 +1349,7 @@
               <w:rPr>
                 <w:sz w:val="18"/>
               </w:rPr>
-              <w:t>403-table validated PostgreSQL schema (core + 14 modules)</w:t>
+              <w:t>447-table validated PostgreSQL schema (core + 14 modules)</w:t>
             </w:r>
           </w:p>
         </w:tc>

</xml_diff>

<commit_message>
Refresh index/overview docs to final state (counts + delivered status)
Update stale schema/contract/test counts (447 tables, 1,907 FKs, 443 RLS, 700 enums;
1,306 API operations; 1,597 test cases) across README/architecture/phased-plan/overview,
and rewrite the executive overview status + 'what remains' section to reflect that all
build-pipeline artefacts and the CSV/prototype reconciliation are delivered.

Co-Authored-By: Claude Opus 4.8 (1M context) <noreply@anthropic.com>
</commit_message>
<xml_diff>
--- a/docs/docx/EXECUTIVE_OVERVIEW.docx
+++ b/docs/docx/EXECUTIVE_OVERVIEW.docx
@@ -85,7 +85,7 @@
         <w:t>Status:</w:t>
       </w:r>
       <w:r>
-        <w:t xml:space="preserve"> Specification + data model complete and validated; build-pipeline artefacts pending.</w:t>
+        <w:t xml:space="preserve"> Complete — specification, validated data model, contracts, phased plan, and acceptance tests all delivered; reconciled to source CSVs + prototype.</w:t>
       </w:r>
     </w:p>
     <w:p>
@@ -977,7 +977,7 @@
     </w:p>
     <w:p>
       <w:r>
-        <w:t>PostgreSQL instance (1,769 foreign keys, 399 row-level-security tables, 673 enums, all seed data inserting).</w:t>
+        <w:t>PostgreSQL instance (1,907 foreign keys, 443 row-level-security tables, 700 enums, all seed data inserting).</w:t>
       </w:r>
     </w:p>
     <w:p>
@@ -1424,17 +1424,12 @@
           <w:color w:val="1F3864"/>
           <w:sz w:val="30"/>
         </w:rPr>
-        <w:t>6. What remains (next increment)</w:t>
+        <w:t>6. Build-pipeline artefacts (delivered)</w:t>
       </w:r>
     </w:p>
     <w:p>
       <w:r>
-        <w:t>The downstream build-pipeline artefacts were not yet produced (work was interrupted by an account</w:t>
-      </w:r>
-    </w:p>
-    <w:p>
-      <w:r>
-        <w:t>spend limit, which blocks the multi-agent generation these need):</w:t>
+        <w:t>All downstream artefacts have now been produced and are in the repo:</w:t>
       </w:r>
     </w:p>
     <w:p>
@@ -1448,7 +1443,17 @@
         <w:t>Architecture document</w:t>
       </w:r>
       <w:r>
-        <w:t xml:space="preserve"> consolidating the 14 modules on the platform.</w:t>
+        <w:t xml:space="preserve"> (</w:t>
+      </w:r>
+      <w:r>
+        <w:rPr>
+          <w:rFonts w:ascii="Consolas" w:hAnsi="Consolas"/>
+          <w:sz w:val="20"/>
+        </w:rPr>
+        <w:t>docs/architecture.md</w:t>
+      </w:r>
+      <w:r>
+        <w:t>) — 14 modules on the platform + 11 ADRs.</w:t>
       </w:r>
     </w:p>
     <w:p>
@@ -1462,12 +1467,64 @@
         <w:t>Machine-readable contracts</w:t>
       </w:r>
       <w:r>
-        <w:t xml:space="preserve"> (OpenAPI, auth matrix, error taxonomy, state machines) — partially already</w:t>
+        <w:t xml:space="preserve"> (</w:t>
+      </w:r>
+      <w:r>
+        <w:rPr>
+          <w:rFonts w:ascii="Consolas" w:hAnsi="Consolas"/>
+          <w:sz w:val="20"/>
+        </w:rPr>
+        <w:t>docs/contracts/</w:t>
+      </w:r>
+      <w:r>
+        <w:t>) — OpenAPI 3.1 for all 14 modules (**1,132 paths /</w:t>
       </w:r>
     </w:p>
     <w:p>
       <w:r>
-        <w:t>embedded in the BRDs and platform foundation.</w:t>
+        <w:t xml:space="preserve">1,306 operations**), </w:t>
+      </w:r>
+      <w:r>
+        <w:rPr>
+          <w:rFonts w:ascii="Consolas" w:hAnsi="Consolas"/>
+          <w:sz w:val="20"/>
+        </w:rPr>
+        <w:t>auth-matrix.yaml</w:t>
+      </w:r>
+      <w:r>
+        <w:t xml:space="preserve"> (76 roles), </w:t>
+      </w:r>
+      <w:r>
+        <w:rPr>
+          <w:rFonts w:ascii="Consolas" w:hAnsi="Consolas"/>
+          <w:sz w:val="20"/>
+        </w:rPr>
+        <w:t>error-taxonomy.yaml</w:t>
+      </w:r>
+      <w:r>
+        <w:t xml:space="preserve"> (311 codes),</w:t>
+      </w:r>
+    </w:p>
+    <w:p>
+      <w:r>
+        <w:rPr>
+          <w:rFonts w:ascii="Consolas" w:hAnsi="Consolas"/>
+          <w:sz w:val="20"/>
+        </w:rPr>
+        <w:t>state-machines.yaml</w:t>
+      </w:r>
+      <w:r>
+        <w:t xml:space="preserve"> (73 machines), </w:t>
+      </w:r>
+      <w:r>
+        <w:rPr>
+          <w:rFonts w:ascii="Consolas" w:hAnsi="Consolas"/>
+          <w:sz w:val="20"/>
+        </w:rPr>
+        <w:t>dependency-register.yaml</w:t>
+      </w:r>
+      <w:r>
+        <w:t>.</w:t>
       </w:r>
     </w:p>
     <w:p>
@@ -1478,15 +1535,29 @@
         <w:rPr>
           <w:b/>
         </w:rPr>
-        <w:t>Per-FR LLDs and acceptance/E2E test cases</w:t>
+        <w:t>Acceptance &amp; E2E test suites</w:t>
       </w:r>
       <w:r>
-        <w:t xml:space="preserve"> — note each v3 BRD already embeds a low-level design table</w:t>
+        <w:t xml:space="preserve"> (</w:t>
       </w:r>
-    </w:p>
-    <w:p>
       <w:r>
-        <w:t>and test guidance per functional requirement, so this stage is partly discharged.</w:t>
+        <w:rPr>
+          <w:rFonts w:ascii="Consolas" w:hAnsi="Consolas"/>
+          <w:sz w:val="20"/>
+        </w:rPr>
+        <w:t>docs/tests/</w:t>
+      </w:r>
+      <w:r>
+        <w:t xml:space="preserve">) — </w:t>
+      </w:r>
+      <w:r>
+        <w:rPr>
+          <w:b/>
+        </w:rPr>
+        <w:t>1,597 test cases</w:t>
+      </w:r>
+      <w:r>
+        <w:t>, every FR covered (0 gaps).</w:t>
       </w:r>
     </w:p>
     <w:p>
@@ -1500,17 +1571,92 @@
         <w:t>Dependency-ordered phased build plan</w:t>
       </w:r>
       <w:r>
-        <w:t xml:space="preserve"> across the 14 modules.</w:t>
+        <w:t xml:space="preserve"> (</w:t>
+      </w:r>
+      <w:r>
+        <w:rPr>
+          <w:rFonts w:ascii="Consolas" w:hAnsi="Consolas"/>
+          <w:sz w:val="20"/>
+        </w:rPr>
+        <w:t>docs/phased-plan.md</w:t>
+      </w:r>
+      <w:r>
+        <w:t>).</w:t>
+      </w:r>
+    </w:p>
+    <w:p>
+      <w:pPr>
+        <w:pStyle w:val="ListBullet"/>
+      </w:pPr>
+      <w:r>
+        <w:rPr>
+          <w:b/>
+        </w:rPr>
+        <w:t>Field reconciliation</w:t>
+      </w:r>
+      <w:r>
+        <w:t xml:space="preserve"> (</w:t>
+      </w:r>
+      <w:r>
+        <w:rPr>
+          <w:rFonts w:ascii="Consolas" w:hAnsi="Consolas"/>
+          <w:sz w:val="20"/>
+        </w:rPr>
+        <w:t>docs/data-model/reconciliation/</w:t>
+      </w:r>
+      <w:r>
+        <w:t>) — the schema and BRDs were reconciled against</w:t>
       </w:r>
     </w:p>
     <w:p>
       <w:r>
-        <w:t>Recommended build sequence (from the schema dependencies): platform core → G01/G12/G13 (foundational</w:t>
+        <w:t xml:space="preserve">the 116 Darwinbox CSV field exports and the 296-screen prototype; data model grew </w:t>
+      </w:r>
+      <w:r>
+        <w:rPr>
+          <w:b/>
+        </w:rPr>
+        <w:t>403 → 447 tables</w:t>
+      </w:r>
+      <w:r>
+        <w:t>;</w:t>
       </w:r>
     </w:p>
     <w:p>
       <w:r>
-        <w:t>systems of record) → G02/G03 → G04/G05/G06/G08/G09 → G10/G11 → G14.</w:t>
+        <w:t xml:space="preserve">BRDs synced to </w:t>
+      </w:r>
+      <w:r>
+        <w:rPr>
+          <w:b/>
+        </w:rPr>
+        <w:t>v3.2</w:t>
+      </w:r>
+      <w:r>
+        <w:t>; OpenAPI + tests refreshed for the changed modules.</w:t>
+      </w:r>
+    </w:p>
+    <w:p>
+      <w:pPr>
+        <w:pStyle w:val="Heading2"/>
+      </w:pPr>
+      <w:r>
+        <w:rPr>
+          <w:b/>
+          <w:color w:val="1F3864"/>
+          <w:sz w:val="30"/>
+        </w:rPr>
+        <w:t>7. Recommended build sequence</w:t>
+      </w:r>
+    </w:p>
+    <w:p>
+      <w:r>
+        <w:t>From the schema dependencies: platform core → G01/G12/G13 (foundational systems of record) → G02/G03 →</w:t>
+      </w:r>
+    </w:p>
+    <w:p>
+      <w:r>
+        <w:t>G04/G05/G06/G08/G09 → G10/G11 → G14.</w:t>
       </w:r>
     </w:p>
     <w:sectPr>

</xml_diff>